<commit_message>
exp001 fix screening consistency and financial handling
</commit_message>
<xml_diff>
--- a/reports/draft/beyond_buffett_report.docx
+++ b/reports/draft/beyond_buffett_report.docx
@@ -133,7 +133,7 @@
           </w:tcPr>
           <w:p>
             <w:r>
-              <w:t>1917</w:t>
+              <w:t>1963</w:t>
             </w:r>
           </w:p>
         </w:tc>
@@ -155,7 +155,7 @@
           </w:tcPr>
           <w:p>
             <w:r>
-              <w:t>1917</w:t>
+              <w:t>1963</w:t>
             </w:r>
           </w:p>
         </w:tc>
@@ -381,7 +381,7 @@
           </w:tcPr>
           <w:p>
             <w:r>
-              <w:t>114</w:t>
+              <w:t>118</w:t>
             </w:r>
           </w:p>
         </w:tc>
@@ -391,7 +391,7 @@
           </w:tcPr>
           <w:p>
             <w:r>
-              <w:t>386004.0</w:t>
+              <w:t>399548.0</w:t>
             </w:r>
           </w:p>
         </w:tc>
@@ -401,7 +401,89 @@
           </w:tcPr>
           <w:p>
             <w:r>
-              <w:t>0.0772008</w:t>
+              <w:t>0.0799096</w:t>
+            </w:r>
+          </w:p>
+        </w:tc>
+      </w:tr>
+      <w:tr>
+        <w:tc>
+          <w:tcPr>
+            <w:tcW w:type="dxa" w:w="1080"/>
+          </w:tcPr>
+          <w:p>
+            <w:r>
+              <w:t>7181</w:t>
+            </w:r>
+          </w:p>
+        </w:tc>
+        <w:tc>
+          <w:tcPr>
+            <w:tcW w:type="dxa" w:w="1080"/>
+          </w:tcPr>
+          <w:p>
+            <w:r>
+              <w:t>7181.T</w:t>
+            </w:r>
+          </w:p>
+        </w:tc>
+        <w:tc>
+          <w:tcPr>
+            <w:tcW w:type="dxa" w:w="1080"/>
+          </w:tcPr>
+          <w:p>
+            <w:r>
+              <w:t>株式会社かんぽ生命保険</w:t>
+            </w:r>
+          </w:p>
+        </w:tc>
+        <w:tc>
+          <w:tcPr>
+            <w:tcW w:type="dxa" w:w="1080"/>
+          </w:tcPr>
+          <w:p>
+            <w:r>
+              <w:t>Insurance</w:t>
+            </w:r>
+          </w:p>
+        </w:tc>
+        <w:tc>
+          <w:tcPr>
+            <w:tcW w:type="dxa" w:w="1080"/>
+          </w:tcPr>
+          <w:p>
+            <w:r>
+              <w:t>Transformation Moat</w:t>
+            </w:r>
+          </w:p>
+        </w:tc>
+        <w:tc>
+          <w:tcPr>
+            <w:tcW w:type="dxa" w:w="1080"/>
+          </w:tcPr>
+          <w:p>
+            <w:r>
+              <w:t>251</w:t>
+            </w:r>
+          </w:p>
+        </w:tc>
+        <w:tc>
+          <w:tcPr>
+            <w:tcW w:type="dxa" w:w="1080"/>
+          </w:tcPr>
+          <w:p>
+            <w:r>
+              <w:t>352906.0</w:t>
+            </w:r>
+          </w:p>
+        </w:tc>
+        <w:tc>
+          <w:tcPr>
+            <w:tcW w:type="dxa" w:w="1080"/>
+          </w:tcPr>
+          <w:p>
+            <w:r>
+              <w:t>0.0705812</w:t>
             </w:r>
           </w:p>
         </w:tc>
@@ -463,7 +545,7 @@
           </w:tcPr>
           <w:p>
             <w:r>
-              <w:t>527</w:t>
+              <w:t>546</w:t>
             </w:r>
           </w:p>
         </w:tc>
@@ -473,7 +555,7 @@
           </w:tcPr>
           <w:p>
             <w:r>
-              <w:t>294540.31286621094</w:t>
+              <w:t>305159.4133300781</w:t>
             </w:r>
           </w:p>
         </w:tc>
@@ -483,89 +565,7 @@
           </w:tcPr>
           <w:p>
             <w:r>
-              <w:t>0.0589080625732421</w:t>
-            </w:r>
-          </w:p>
-        </w:tc>
-      </w:tr>
-      <w:tr>
-        <w:tc>
-          <w:tcPr>
-            <w:tcW w:type="dxa" w:w="1080"/>
-          </w:tcPr>
-          <w:p>
-            <w:r>
-              <w:t>8309</w:t>
-            </w:r>
-          </w:p>
-        </w:tc>
-        <w:tc>
-          <w:tcPr>
-            <w:tcW w:type="dxa" w:w="1080"/>
-          </w:tcPr>
-          <w:p>
-            <w:r>
-              <w:t>8309.T</w:t>
-            </w:r>
-          </w:p>
-        </w:tc>
-        <w:tc>
-          <w:tcPr>
-            <w:tcW w:type="dxa" w:w="1080"/>
-          </w:tcPr>
-          <w:p>
-            <w:r>
-              <w:t>三井住友トラストグループ株式会社</w:t>
-            </w:r>
-          </w:p>
-        </w:tc>
-        <w:tc>
-          <w:tcPr>
-            <w:tcW w:type="dxa" w:w="1080"/>
-          </w:tcPr>
-          <w:p>
-            <w:r>
-              <w:t>Banks</w:t>
-            </w:r>
-          </w:p>
-        </w:tc>
-        <w:tc>
-          <w:tcPr>
-            <w:tcW w:type="dxa" w:w="1080"/>
-          </w:tcPr>
-          <w:p>
-            <w:r>
-              <w:t>Core Moat</w:t>
-            </w:r>
-          </w:p>
-        </w:tc>
-        <w:tc>
-          <w:tcPr>
-            <w:tcW w:type="dxa" w:w="1080"/>
-          </w:tcPr>
-          <w:p>
-            <w:r>
-              <w:t>52</w:t>
-            </w:r>
-          </w:p>
-        </w:tc>
-        <w:tc>
-          <w:tcPr>
-            <w:tcW w:type="dxa" w:w="1080"/>
-          </w:tcPr>
-          <w:p>
-            <w:r>
-              <w:t>284336.0</w:t>
-            </w:r>
-          </w:p>
-        </w:tc>
-        <w:tc>
-          <w:tcPr>
-            <w:tcW w:type="dxa" w:w="1080"/>
-          </w:tcPr>
-          <w:p>
-            <w:r>
-              <w:t>0.0568672</w:t>
+              <w:t>0.0610318826660156</w:t>
             </w:r>
           </w:p>
         </w:tc>
@@ -627,7 +627,7 @@
           </w:tcPr>
           <w:p>
             <w:r>
-              <w:t>41</w:t>
+              <w:t>42</w:t>
             </w:r>
           </w:p>
         </w:tc>
@@ -637,7 +637,7 @@
           </w:tcPr>
           <w:p>
             <w:r>
-              <w:t>280030.0</w:t>
+              <w:t>286860.0</w:t>
             </w:r>
           </w:p>
         </w:tc>
@@ -647,7 +647,7 @@
           </w:tcPr>
           <w:p>
             <w:r>
-              <w:t>0.056006</w:t>
+              <w:t>0.057372</w:t>
             </w:r>
           </w:p>
         </w:tc>
@@ -659,7 +659,7 @@
           </w:tcPr>
           <w:p>
             <w:r>
-              <w:t>8630</w:t>
+              <w:t>6524</w:t>
             </w:r>
           </w:p>
         </w:tc>
@@ -669,7 +669,7 @@
           </w:tcPr>
           <w:p>
             <w:r>
-              <w:t>8630.T</w:t>
+              <w:t>6524.T</w:t>
             </w:r>
           </w:p>
         </w:tc>
@@ -679,7 +679,7 @@
           </w:tcPr>
           <w:p>
             <w:r>
-              <w:t>ＳＯＭＰＯホールディングス株式会社</w:t>
+              <w:t>湖北工業株式会社</w:t>
             </w:r>
           </w:p>
         </w:tc>
@@ -689,7 +689,7 @@
           </w:tcPr>
           <w:p>
             <w:r>
-              <w:t>Insurance</w:t>
+              <w:t>Electric Appliances</w:t>
             </w:r>
           </w:p>
         </w:tc>
@@ -699,7 +699,7 @@
           </w:tcPr>
           <w:p>
             <w:r>
-              <w:t>Core Moat</w:t>
+              <w:t>Future Moat</w:t>
             </w:r>
           </w:p>
         </w:tc>
@@ -709,7 +709,7 @@
           </w:tcPr>
           <w:p>
             <w:r>
-              <w:t>46</w:t>
+              <w:t>42</w:t>
             </w:r>
           </w:p>
         </w:tc>
@@ -719,7 +719,7 @@
           </w:tcPr>
           <w:p>
             <w:r>
-              <w:t>271676.0</w:t>
+              <w:t>254940.0</w:t>
             </w:r>
           </w:p>
         </w:tc>
@@ -729,7 +729,7 @@
           </w:tcPr>
           <w:p>
             <w:r>
-              <w:t>0.0543352</w:t>
+              <w:t>0.050988</w:t>
             </w:r>
           </w:p>
         </w:tc>
@@ -741,7 +741,7 @@
           </w:tcPr>
           <w:p>
             <w:r>
-              <w:t>8473</w:t>
+              <w:t>6627</w:t>
             </w:r>
           </w:p>
         </w:tc>
@@ -751,7 +751,7 @@
           </w:tcPr>
           <w:p>
             <w:r>
-              <w:t>8473.T</w:t>
+              <w:t>6627.T</w:t>
             </w:r>
           </w:p>
         </w:tc>
@@ -761,7 +761,7 @@
           </w:tcPr>
           <w:p>
             <w:r>
-              <w:t>ＳＢＩホールディングス株式会社</w:t>
+              <w:t>株式会社テラプローブ</w:t>
             </w:r>
           </w:p>
         </w:tc>
@@ -771,7 +771,7 @@
           </w:tcPr>
           <w:p>
             <w:r>
-              <w:t>Securities and Commodities Futures</w:t>
+              <w:t>Electric Appliances</w:t>
             </w:r>
           </w:p>
         </w:tc>
@@ -781,7 +781,7 @@
           </w:tcPr>
           <w:p>
             <w:r>
-              <w:t>Transformation Moat</w:t>
+              <w:t>Future Moat</w:t>
             </w:r>
           </w:p>
         </w:tc>
@@ -791,7 +791,7 @@
           </w:tcPr>
           <w:p>
             <w:r>
-              <w:t>93</w:t>
+              <w:t>23</w:t>
             </w:r>
           </w:p>
         </w:tc>
@@ -801,7 +801,7 @@
           </w:tcPr>
           <w:p>
             <w:r>
-              <w:t>270723.0</w:t>
+              <w:t>253920.0</w:t>
             </w:r>
           </w:p>
         </w:tc>
@@ -811,89 +811,7 @@
           </w:tcPr>
           <w:p>
             <w:r>
-              <w:t>0.0541446</w:t>
-            </w:r>
-          </w:p>
-        </w:tc>
-      </w:tr>
-      <w:tr>
-        <w:tc>
-          <w:tcPr>
-            <w:tcW w:type="dxa" w:w="1080"/>
-          </w:tcPr>
-          <w:p>
-            <w:r>
-              <w:t>6178</w:t>
-            </w:r>
-          </w:p>
-        </w:tc>
-        <w:tc>
-          <w:tcPr>
-            <w:tcW w:type="dxa" w:w="1080"/>
-          </w:tcPr>
-          <w:p>
-            <w:r>
-              <w:t>6178.T</w:t>
-            </w:r>
-          </w:p>
-        </w:tc>
-        <w:tc>
-          <w:tcPr>
-            <w:tcW w:type="dxa" w:w="1080"/>
-          </w:tcPr>
-          <w:p>
-            <w:r>
-              <w:t>日本郵政株式会社</w:t>
-            </w:r>
-          </w:p>
-        </w:tc>
-        <w:tc>
-          <w:tcPr>
-            <w:tcW w:type="dxa" w:w="1080"/>
-          </w:tcPr>
-          <w:p>
-            <w:r>
-              <w:t>Services</w:t>
-            </w:r>
-          </w:p>
-        </w:tc>
-        <w:tc>
-          <w:tcPr>
-            <w:tcW w:type="dxa" w:w="1080"/>
-          </w:tcPr>
-          <w:p>
-            <w:r>
-              <w:t>Core Moat</w:t>
-            </w:r>
-          </w:p>
-        </w:tc>
-        <w:tc>
-          <w:tcPr>
-            <w:tcW w:type="dxa" w:w="1080"/>
-          </w:tcPr>
-          <w:p>
-            <w:r>
-              <w:t>126</w:t>
-            </w:r>
-          </w:p>
-        </w:tc>
-        <w:tc>
-          <w:tcPr>
-            <w:tcW w:type="dxa" w:w="1080"/>
-          </w:tcPr>
-          <w:p>
-            <w:r>
-              <w:t>256410.0</w:t>
-            </w:r>
-          </w:p>
-        </w:tc>
-        <w:tc>
-          <w:tcPr>
-            <w:tcW w:type="dxa" w:w="1080"/>
-          </w:tcPr>
-          <w:p>
-            <w:r>
-              <w:t>0.051282</w:t>
+              <w:t>0.050784</w:t>
             </w:r>
           </w:p>
         </w:tc>
@@ -987,252 +905,6 @@
           </w:tcPr>
           <w:p>
             <w:r>
-              <w:t>5844</w:t>
-            </w:r>
-          </w:p>
-        </w:tc>
-        <w:tc>
-          <w:tcPr>
-            <w:tcW w:type="dxa" w:w="1080"/>
-          </w:tcPr>
-          <w:p>
-            <w:r>
-              <w:t>5844.T</w:t>
-            </w:r>
-          </w:p>
-        </w:tc>
-        <w:tc>
-          <w:tcPr>
-            <w:tcW w:type="dxa" w:w="1080"/>
-          </w:tcPr>
-          <w:p>
-            <w:r>
-              <w:t>株式会社京都フィナンシャルグループ</w:t>
-            </w:r>
-          </w:p>
-        </w:tc>
-        <w:tc>
-          <w:tcPr>
-            <w:tcW w:type="dxa" w:w="1080"/>
-          </w:tcPr>
-          <w:p>
-            <w:r>
-              <w:t>Banks</w:t>
-            </w:r>
-          </w:p>
-        </w:tc>
-        <w:tc>
-          <w:tcPr>
-            <w:tcW w:type="dxa" w:w="1080"/>
-          </w:tcPr>
-          <w:p>
-            <w:r>
-              <w:t>Core Moat</w:t>
-            </w:r>
-          </w:p>
-        </w:tc>
-        <w:tc>
-          <w:tcPr>
-            <w:tcW w:type="dxa" w:w="1080"/>
-          </w:tcPr>
-          <w:p>
-            <w:r>
-              <w:t>57</w:t>
-            </w:r>
-          </w:p>
-        </w:tc>
-        <w:tc>
-          <w:tcPr>
-            <w:tcW w:type="dxa" w:w="1080"/>
-          </w:tcPr>
-          <w:p>
-            <w:r>
-              <w:t>247437.0</w:t>
-            </w:r>
-          </w:p>
-        </w:tc>
-        <w:tc>
-          <w:tcPr>
-            <w:tcW w:type="dxa" w:w="1080"/>
-          </w:tcPr>
-          <w:p>
-            <w:r>
-              <w:t>0.0494874</w:t>
-            </w:r>
-          </w:p>
-        </w:tc>
-      </w:tr>
-      <w:tr>
-        <w:tc>
-          <w:tcPr>
-            <w:tcW w:type="dxa" w:w="1080"/>
-          </w:tcPr>
-          <w:p>
-            <w:r>
-              <w:t>6627</w:t>
-            </w:r>
-          </w:p>
-        </w:tc>
-        <w:tc>
-          <w:tcPr>
-            <w:tcW w:type="dxa" w:w="1080"/>
-          </w:tcPr>
-          <w:p>
-            <w:r>
-              <w:t>6627.T</w:t>
-            </w:r>
-          </w:p>
-        </w:tc>
-        <w:tc>
-          <w:tcPr>
-            <w:tcW w:type="dxa" w:w="1080"/>
-          </w:tcPr>
-          <w:p>
-            <w:r>
-              <w:t>株式会社テラプローブ</w:t>
-            </w:r>
-          </w:p>
-        </w:tc>
-        <w:tc>
-          <w:tcPr>
-            <w:tcW w:type="dxa" w:w="1080"/>
-          </w:tcPr>
-          <w:p>
-            <w:r>
-              <w:t>Electric Appliances</w:t>
-            </w:r>
-          </w:p>
-        </w:tc>
-        <w:tc>
-          <w:tcPr>
-            <w:tcW w:type="dxa" w:w="1080"/>
-          </w:tcPr>
-          <w:p>
-            <w:r>
-              <w:t>Future Moat</w:t>
-            </w:r>
-          </w:p>
-        </w:tc>
-        <w:tc>
-          <w:tcPr>
-            <w:tcW w:type="dxa" w:w="1080"/>
-          </w:tcPr>
-          <w:p>
-            <w:r>
-              <w:t>22</w:t>
-            </w:r>
-          </w:p>
-        </w:tc>
-        <w:tc>
-          <w:tcPr>
-            <w:tcW w:type="dxa" w:w="1080"/>
-          </w:tcPr>
-          <w:p>
-            <w:r>
-              <w:t>242880.0</w:t>
-            </w:r>
-          </w:p>
-        </w:tc>
-        <w:tc>
-          <w:tcPr>
-            <w:tcW w:type="dxa" w:w="1080"/>
-          </w:tcPr>
-          <w:p>
-            <w:r>
-              <w:t>0.048576</w:t>
-            </w:r>
-          </w:p>
-        </w:tc>
-      </w:tr>
-      <w:tr>
-        <w:tc>
-          <w:tcPr>
-            <w:tcW w:type="dxa" w:w="1080"/>
-          </w:tcPr>
-          <w:p>
-            <w:r>
-              <w:t>6524</w:t>
-            </w:r>
-          </w:p>
-        </w:tc>
-        <w:tc>
-          <w:tcPr>
-            <w:tcW w:type="dxa" w:w="1080"/>
-          </w:tcPr>
-          <w:p>
-            <w:r>
-              <w:t>6524.T</w:t>
-            </w:r>
-          </w:p>
-        </w:tc>
-        <w:tc>
-          <w:tcPr>
-            <w:tcW w:type="dxa" w:w="1080"/>
-          </w:tcPr>
-          <w:p>
-            <w:r>
-              <w:t>湖北工業株式会社</w:t>
-            </w:r>
-          </w:p>
-        </w:tc>
-        <w:tc>
-          <w:tcPr>
-            <w:tcW w:type="dxa" w:w="1080"/>
-          </w:tcPr>
-          <w:p>
-            <w:r>
-              <w:t>Electric Appliances</w:t>
-            </w:r>
-          </w:p>
-        </w:tc>
-        <w:tc>
-          <w:tcPr>
-            <w:tcW w:type="dxa" w:w="1080"/>
-          </w:tcPr>
-          <w:p>
-            <w:r>
-              <w:t>Future Moat</w:t>
-            </w:r>
-          </w:p>
-        </w:tc>
-        <w:tc>
-          <w:tcPr>
-            <w:tcW w:type="dxa" w:w="1080"/>
-          </w:tcPr>
-          <w:p>
-            <w:r>
-              <w:t>40</w:t>
-            </w:r>
-          </w:p>
-        </w:tc>
-        <w:tc>
-          <w:tcPr>
-            <w:tcW w:type="dxa" w:w="1080"/>
-          </w:tcPr>
-          <w:p>
-            <w:r>
-              <w:t>242800.0</w:t>
-            </w:r>
-          </w:p>
-        </w:tc>
-        <w:tc>
-          <w:tcPr>
-            <w:tcW w:type="dxa" w:w="1080"/>
-          </w:tcPr>
-          <w:p>
-            <w:r>
-              <w:t>0.04856</w:t>
-            </w:r>
-          </w:p>
-        </w:tc>
-      </w:tr>
-      <w:tr>
-        <w:tc>
-          <w:tcPr>
-            <w:tcW w:type="dxa" w:w="1080"/>
-          </w:tcPr>
-          <w:p>
-            <w:r>
               <w:t>6387</w:t>
             </w:r>
           </w:p>
@@ -1283,7 +955,7 @@
           </w:tcPr>
           <w:p>
             <w:r>
-              <w:t>21</w:t>
+              <w:t>22</w:t>
             </w:r>
           </w:p>
         </w:tc>
@@ -1293,7 +965,7 @@
           </w:tcPr>
           <w:p>
             <w:r>
-              <w:t>232050.0</w:t>
+              <w:t>243100.0</w:t>
             </w:r>
           </w:p>
         </w:tc>
@@ -1303,7 +975,89 @@
           </w:tcPr>
           <w:p>
             <w:r>
-              <w:t>0.04641</w:t>
+              <w:t>0.04862</w:t>
+            </w:r>
+          </w:p>
+        </w:tc>
+      </w:tr>
+      <w:tr>
+        <w:tc>
+          <w:tcPr>
+            <w:tcW w:type="dxa" w:w="1080"/>
+          </w:tcPr>
+          <w:p>
+            <w:r>
+              <w:t>8473</w:t>
+            </w:r>
+          </w:p>
+        </w:tc>
+        <w:tc>
+          <w:tcPr>
+            <w:tcW w:type="dxa" w:w="1080"/>
+          </w:tcPr>
+          <w:p>
+            <w:r>
+              <w:t>8473.T</w:t>
+            </w:r>
+          </w:p>
+        </w:tc>
+        <w:tc>
+          <w:tcPr>
+            <w:tcW w:type="dxa" w:w="1080"/>
+          </w:tcPr>
+          <w:p>
+            <w:r>
+              <w:t>ＳＢＩホールディングス株式会社</w:t>
+            </w:r>
+          </w:p>
+        </w:tc>
+        <w:tc>
+          <w:tcPr>
+            <w:tcW w:type="dxa" w:w="1080"/>
+          </w:tcPr>
+          <w:p>
+            <w:r>
+              <w:t>Securities and Commodities Futures</w:t>
+            </w:r>
+          </w:p>
+        </w:tc>
+        <w:tc>
+          <w:tcPr>
+            <w:tcW w:type="dxa" w:w="1080"/>
+          </w:tcPr>
+          <w:p>
+            <w:r>
+              <w:t>Transformation Moat</w:t>
+            </w:r>
+          </w:p>
+        </w:tc>
+        <w:tc>
+          <w:tcPr>
+            <w:tcW w:type="dxa" w:w="1080"/>
+          </w:tcPr>
+          <w:p>
+            <w:r>
+              <w:t>83</w:t>
+            </w:r>
+          </w:p>
+        </w:tc>
+        <w:tc>
+          <w:tcPr>
+            <w:tcW w:type="dxa" w:w="1080"/>
+          </w:tcPr>
+          <w:p>
+            <w:r>
+              <w:t>241613.0</w:t>
+            </w:r>
+          </w:p>
+        </w:tc>
+        <w:tc>
+          <w:tcPr>
+            <w:tcW w:type="dxa" w:w="1080"/>
+          </w:tcPr>
+          <w:p>
+            <w:r>
+              <w:t>0.0483226</w:t>
             </w:r>
           </w:p>
         </w:tc>
@@ -1365,7 +1119,7 @@
           </w:tcPr>
           <w:p>
             <w:r>
-              <w:t>44</w:t>
+              <w:t>46</w:t>
             </w:r>
           </w:p>
         </w:tc>
@@ -1375,7 +1129,7 @@
           </w:tcPr>
           <w:p>
             <w:r>
-              <w:t>227480.0</w:t>
+              <w:t>237820.0</w:t>
             </w:r>
           </w:p>
         </w:tc>
@@ -1385,7 +1139,7 @@
           </w:tcPr>
           <w:p>
             <w:r>
-              <w:t>0.045496</w:t>
+              <w:t>0.047564</w:t>
             </w:r>
           </w:p>
         </w:tc>
@@ -1447,7 +1201,7 @@
           </w:tcPr>
           <w:p>
             <w:r>
-              <w:t>57</w:t>
+              <w:t>60</w:t>
             </w:r>
           </w:p>
         </w:tc>
@@ -1457,7 +1211,7 @@
           </w:tcPr>
           <w:p>
             <w:r>
-              <w:t>225378.0</w:t>
+              <w:t>237240.0</w:t>
             </w:r>
           </w:p>
         </w:tc>
@@ -1467,7 +1221,7 @@
           </w:tcPr>
           <w:p>
             <w:r>
-              <w:t>0.0450756</w:t>
+              <w:t>0.047448</w:t>
             </w:r>
           </w:p>
         </w:tc>
@@ -1529,7 +1283,7 @@
           </w:tcPr>
           <w:p>
             <w:r>
-              <w:t>30</w:t>
+              <w:t>31</w:t>
             </w:r>
           </w:p>
         </w:tc>
@@ -1539,7 +1293,7 @@
           </w:tcPr>
           <w:p>
             <w:r>
-              <w:t>222600.0</w:t>
+              <w:t>230020.0</w:t>
             </w:r>
           </w:p>
         </w:tc>
@@ -1549,7 +1303,89 @@
           </w:tcPr>
           <w:p>
             <w:r>
-              <w:t>0.04452</w:t>
+              <w:t>0.046004</w:t>
+            </w:r>
+          </w:p>
+        </w:tc>
+      </w:tr>
+      <w:tr>
+        <w:tc>
+          <w:tcPr>
+            <w:tcW w:type="dxa" w:w="1080"/>
+          </w:tcPr>
+          <w:p>
+            <w:r>
+              <w:t>8309</w:t>
+            </w:r>
+          </w:p>
+        </w:tc>
+        <w:tc>
+          <w:tcPr>
+            <w:tcW w:type="dxa" w:w="1080"/>
+          </w:tcPr>
+          <w:p>
+            <w:r>
+              <w:t>8309.T</w:t>
+            </w:r>
+          </w:p>
+        </w:tc>
+        <w:tc>
+          <w:tcPr>
+            <w:tcW w:type="dxa" w:w="1080"/>
+          </w:tcPr>
+          <w:p>
+            <w:r>
+              <w:t>三井住友トラストグループ株式会社</w:t>
+            </w:r>
+          </w:p>
+        </w:tc>
+        <w:tc>
+          <w:tcPr>
+            <w:tcW w:type="dxa" w:w="1080"/>
+          </w:tcPr>
+          <w:p>
+            <w:r>
+              <w:t>Banks</w:t>
+            </w:r>
+          </w:p>
+        </w:tc>
+        <w:tc>
+          <w:tcPr>
+            <w:tcW w:type="dxa" w:w="1080"/>
+          </w:tcPr>
+          <w:p>
+            <w:r>
+              <w:t>Transformation Moat</w:t>
+            </w:r>
+          </w:p>
+        </w:tc>
+        <w:tc>
+          <w:tcPr>
+            <w:tcW w:type="dxa" w:w="1080"/>
+          </w:tcPr>
+          <w:p>
+            <w:r>
+              <w:t>42</w:t>
+            </w:r>
+          </w:p>
+        </w:tc>
+        <w:tc>
+          <w:tcPr>
+            <w:tcW w:type="dxa" w:w="1080"/>
+          </w:tcPr>
+          <w:p>
+            <w:r>
+              <w:t>229656.0</w:t>
+            </w:r>
+          </w:p>
+        </w:tc>
+        <w:tc>
+          <w:tcPr>
+            <w:tcW w:type="dxa" w:w="1080"/>
+          </w:tcPr>
+          <w:p>
+            <w:r>
+              <w:t>0.0459312</w:t>
             </w:r>
           </w:p>
         </w:tc>
@@ -1611,7 +1447,7 @@
           </w:tcPr>
           <w:p>
             <w:r>
-              <w:t>145</w:t>
+              <w:t>151</w:t>
             </w:r>
           </w:p>
         </w:tc>
@@ -1621,7 +1457,7 @@
           </w:tcPr>
           <w:p>
             <w:r>
-              <w:t>216340.0</w:t>
+              <w:t>225292.0</w:t>
             </w:r>
           </w:p>
         </w:tc>
@@ -1631,89 +1467,7 @@
           </w:tcPr>
           <w:p>
             <w:r>
-              <w:t>0.043268</w:t>
-            </w:r>
-          </w:p>
-        </w:tc>
-      </w:tr>
-      <w:tr>
-        <w:tc>
-          <w:tcPr>
-            <w:tcW w:type="dxa" w:w="1080"/>
-          </w:tcPr>
-          <w:p>
-            <w:r>
-              <w:t>9984</w:t>
-            </w:r>
-          </w:p>
-        </w:tc>
-        <w:tc>
-          <w:tcPr>
-            <w:tcW w:type="dxa" w:w="1080"/>
-          </w:tcPr>
-          <w:p>
-            <w:r>
-              <w:t>9984.T</w:t>
-            </w:r>
-          </w:p>
-        </w:tc>
-        <w:tc>
-          <w:tcPr>
-            <w:tcW w:type="dxa" w:w="1080"/>
-          </w:tcPr>
-          <w:p>
-            <w:r>
-              <w:t>ソフトバンクグループ株式会社</w:t>
-            </w:r>
-          </w:p>
-        </w:tc>
-        <w:tc>
-          <w:tcPr>
-            <w:tcW w:type="dxa" w:w="1080"/>
-          </w:tcPr>
-          <w:p>
-            <w:r>
-              <w:t>Information &amp; Communication</w:t>
-            </w:r>
-          </w:p>
-        </w:tc>
-        <w:tc>
-          <w:tcPr>
-            <w:tcW w:type="dxa" w:w="1080"/>
-          </w:tcPr>
-          <w:p>
-            <w:r>
-              <w:t>Core Moat</w:t>
-            </w:r>
-          </w:p>
-        </w:tc>
-        <w:tc>
-          <w:tcPr>
-            <w:tcW w:type="dxa" w:w="1080"/>
-          </w:tcPr>
-          <w:p>
-            <w:r>
-              <w:t>25</w:t>
-            </w:r>
-          </w:p>
-        </w:tc>
-        <w:tc>
-          <w:tcPr>
-            <w:tcW w:type="dxa" w:w="1080"/>
-          </w:tcPr>
-          <w:p>
-            <w:r>
-              <w:t>213525.0</w:t>
-            </w:r>
-          </w:p>
-        </w:tc>
-        <w:tc>
-          <w:tcPr>
-            <w:tcW w:type="dxa" w:w="1080"/>
-          </w:tcPr>
-          <w:p>
-            <w:r>
-              <w:t>0.042705</w:t>
+              <w:t>0.0450584</w:t>
             </w:r>
           </w:p>
         </w:tc>
@@ -1775,7 +1529,7 @@
           </w:tcPr>
           <w:p>
             <w:r>
-              <w:t>26</w:t>
+              <w:t>27</w:t>
             </w:r>
           </w:p>
         </w:tc>
@@ -1785,7 +1539,7 @@
           </w:tcPr>
           <w:p>
             <w:r>
-              <w:t>212680.0</w:t>
+              <w:t>220860.0</w:t>
             </w:r>
           </w:p>
         </w:tc>
@@ -1795,7 +1549,89 @@
           </w:tcPr>
           <w:p>
             <w:r>
-              <w:t>0.042536</w:t>
+              <w:t>0.044172</w:t>
+            </w:r>
+          </w:p>
+        </w:tc>
+      </w:tr>
+      <w:tr>
+        <w:tc>
+          <w:tcPr>
+            <w:tcW w:type="dxa" w:w="1080"/>
+          </w:tcPr>
+          <w:p>
+            <w:r>
+              <w:t>9503</w:t>
+            </w:r>
+          </w:p>
+        </w:tc>
+        <w:tc>
+          <w:tcPr>
+            <w:tcW w:type="dxa" w:w="1080"/>
+          </w:tcPr>
+          <w:p>
+            <w:r>
+              <w:t>9503.T</w:t>
+            </w:r>
+          </w:p>
+        </w:tc>
+        <w:tc>
+          <w:tcPr>
+            <w:tcW w:type="dxa" w:w="1080"/>
+          </w:tcPr>
+          <w:p>
+            <w:r>
+              <w:t>関西電力株式会社</w:t>
+            </w:r>
+          </w:p>
+        </w:tc>
+        <w:tc>
+          <w:tcPr>
+            <w:tcW w:type="dxa" w:w="1080"/>
+          </w:tcPr>
+          <w:p>
+            <w:r>
+              <w:t>Electric Power and Gas</w:t>
+            </w:r>
+          </w:p>
+        </w:tc>
+        <w:tc>
+          <w:tcPr>
+            <w:tcW w:type="dxa" w:w="1080"/>
+          </w:tcPr>
+          <w:p>
+            <w:r>
+              <w:t>Transformation Moat</w:t>
+            </w:r>
+          </w:p>
+        </w:tc>
+        <w:tc>
+          <w:tcPr>
+            <w:tcW w:type="dxa" w:w="1080"/>
+          </w:tcPr>
+          <w:p>
+            <w:r>
+              <w:t>95</w:t>
+            </w:r>
+          </w:p>
+        </w:tc>
+        <w:tc>
+          <w:tcPr>
+            <w:tcW w:type="dxa" w:w="1080"/>
+          </w:tcPr>
+          <w:p>
+            <w:r>
+              <w:t>217407.5</w:t>
+            </w:r>
+          </w:p>
+        </w:tc>
+        <w:tc>
+          <w:tcPr>
+            <w:tcW w:type="dxa" w:w="1080"/>
+          </w:tcPr>
+          <w:p>
+            <w:r>
+              <w:t>0.0434815</w:t>
             </w:r>
           </w:p>
         </w:tc>
@@ -1889,7 +1725,7 @@
           </w:tcPr>
           <w:p>
             <w:r>
-              <w:t>9503</w:t>
+              <w:t>5985</w:t>
             </w:r>
           </w:p>
         </w:tc>
@@ -1899,7 +1735,7 @@
           </w:tcPr>
           <w:p>
             <w:r>
-              <w:t>9503.T</w:t>
+              <w:t>5985.T</w:t>
             </w:r>
           </w:p>
         </w:tc>
@@ -1909,7 +1745,7 @@
           </w:tcPr>
           <w:p>
             <w:r>
-              <w:t>関西電力株式会社</w:t>
+              <w:t>サンコール株式会社</w:t>
             </w:r>
           </w:p>
         </w:tc>
@@ -1919,7 +1755,7 @@
           </w:tcPr>
           <w:p>
             <w:r>
-              <w:t>Electric Power and Gas</w:t>
+              <w:t>Metal Products</w:t>
             </w:r>
           </w:p>
         </w:tc>
@@ -1939,7 +1775,7 @@
           </w:tcPr>
           <w:p>
             <w:r>
-              <w:t>91</w:t>
+              <w:t>123</w:t>
             </w:r>
           </w:p>
         </w:tc>
@@ -1949,7 +1785,7 @@
           </w:tcPr>
           <w:p>
             <w:r>
-              <w:t>208253.5</w:t>
+              <w:t>207378.0</w:t>
             </w:r>
           </w:p>
         </w:tc>
@@ -1959,7 +1795,171 @@
           </w:tcPr>
           <w:p>
             <w:r>
-              <w:t>0.0416507</w:t>
+              <w:t>0.0414756</w:t>
+            </w:r>
+          </w:p>
+        </w:tc>
+      </w:tr>
+      <w:tr>
+        <w:tc>
+          <w:tcPr>
+            <w:tcW w:type="dxa" w:w="1080"/>
+          </w:tcPr>
+          <w:p>
+            <w:r>
+              <w:t>4368</w:t>
+            </w:r>
+          </w:p>
+        </w:tc>
+        <w:tc>
+          <w:tcPr>
+            <w:tcW w:type="dxa" w:w="1080"/>
+          </w:tcPr>
+          <w:p>
+            <w:r>
+              <w:t>4368.T</w:t>
+            </w:r>
+          </w:p>
+        </w:tc>
+        <w:tc>
+          <w:tcPr>
+            <w:tcW w:type="dxa" w:w="1080"/>
+          </w:tcPr>
+          <w:p>
+            <w:r>
+              <w:t>扶桑化学工業株式会社</w:t>
+            </w:r>
+          </w:p>
+        </w:tc>
+        <w:tc>
+          <w:tcPr>
+            <w:tcW w:type="dxa" w:w="1080"/>
+          </w:tcPr>
+          <w:p>
+            <w:r>
+              <w:t>Chemicals</w:t>
+            </w:r>
+          </w:p>
+        </w:tc>
+        <w:tc>
+          <w:tcPr>
+            <w:tcW w:type="dxa" w:w="1080"/>
+          </w:tcPr>
+          <w:p>
+            <w:r>
+              <w:t>Core Moat</w:t>
+            </w:r>
+          </w:p>
+        </w:tc>
+        <w:tc>
+          <w:tcPr>
+            <w:tcW w:type="dxa" w:w="1080"/>
+          </w:tcPr>
+          <w:p>
+            <w:r>
+              <w:t>46</w:t>
+            </w:r>
+          </w:p>
+        </w:tc>
+        <w:tc>
+          <w:tcPr>
+            <w:tcW w:type="dxa" w:w="1080"/>
+          </w:tcPr>
+          <w:p>
+            <w:r>
+              <w:t>205850.0</w:t>
+            </w:r>
+          </w:p>
+        </w:tc>
+        <w:tc>
+          <w:tcPr>
+            <w:tcW w:type="dxa" w:w="1080"/>
+          </w:tcPr>
+          <w:p>
+            <w:r>
+              <w:t>0.04117</w:t>
+            </w:r>
+          </w:p>
+        </w:tc>
+      </w:tr>
+      <w:tr>
+        <w:tc>
+          <w:tcPr>
+            <w:tcW w:type="dxa" w:w="1080"/>
+          </w:tcPr>
+          <w:p>
+            <w:r>
+              <w:t>3723</w:t>
+            </w:r>
+          </w:p>
+        </w:tc>
+        <w:tc>
+          <w:tcPr>
+            <w:tcW w:type="dxa" w:w="1080"/>
+          </w:tcPr>
+          <w:p>
+            <w:r>
+              <w:t>3723.T</w:t>
+            </w:r>
+          </w:p>
+        </w:tc>
+        <w:tc>
+          <w:tcPr>
+            <w:tcW w:type="dxa" w:w="1080"/>
+          </w:tcPr>
+          <w:p>
+            <w:r>
+              <w:t>日本ファルコム株式会社</w:t>
+            </w:r>
+          </w:p>
+        </w:tc>
+        <w:tc>
+          <w:tcPr>
+            <w:tcW w:type="dxa" w:w="1080"/>
+          </w:tcPr>
+          <w:p>
+            <w:r>
+              <w:t>Information &amp; Communication</w:t>
+            </w:r>
+          </w:p>
+        </w:tc>
+        <w:tc>
+          <w:tcPr>
+            <w:tcW w:type="dxa" w:w="1080"/>
+          </w:tcPr>
+          <w:p>
+            <w:r>
+              <w:t>Discovery</w:t>
+            </w:r>
+          </w:p>
+        </w:tc>
+        <w:tc>
+          <w:tcPr>
+            <w:tcW w:type="dxa" w:w="1080"/>
+          </w:tcPr>
+          <w:p>
+            <w:r>
+              <w:t>79</w:t>
+            </w:r>
+          </w:p>
+        </w:tc>
+        <w:tc>
+          <w:tcPr>
+            <w:tcW w:type="dxa" w:w="1080"/>
+          </w:tcPr>
+          <w:p>
+            <w:r>
+              <w:t>185571.0</w:t>
+            </w:r>
+          </w:p>
+        </w:tc>
+        <w:tc>
+          <w:tcPr>
+            <w:tcW w:type="dxa" w:w="1080"/>
+          </w:tcPr>
+          <w:p>
+            <w:r>
+              <w:t>0.0371142</w:t>
             </w:r>
           </w:p>
         </w:tc>
@@ -2120,7 +2120,7 @@
           </w:tcPr>
           <w:p>
             <w:r>
-              <w:t>4.012420963068697</w:t>
+              <w:t>3.8139259442917046</w:t>
             </w:r>
           </w:p>
         </w:tc>
@@ -2130,7 +2130,7 @@
           </w:tcPr>
           <w:p>
             <w:r>
-              <w:t>0.3943227774607711</w:t>
+              <w:t>0.3827528368609816</w:t>
             </w:r>
           </w:p>
         </w:tc>
@@ -2140,7 +2140,7 @@
           </w:tcPr>
           <w:p>
             <w:r>
-              <w:t>0.2290426055518083</w:t>
+              <w:t>0.2232774622018359</w:t>
             </w:r>
           </w:p>
         </w:tc>
@@ -2150,7 +2150,7 @@
           </w:tcPr>
           <w:p>
             <w:r>
-              <w:t>1.721613219124759</w:t>
+              <w:t>1.7142475245216862</w:t>
             </w:r>
           </w:p>
         </w:tc>
@@ -2160,7 +2160,7 @@
           </w:tcPr>
           <w:p>
             <w:r>
-              <w:t>-0.3327626551728064</w:t>
+              <w:t>-0.3321660437947928</w:t>
             </w:r>
           </w:p>
         </w:tc>
@@ -2170,7 +2170,7 @@
           </w:tcPr>
           <w:p>
             <w:r>
-              <w:t>0.1745116601643583</w:t>
+              <w:t>0.1745610028322853</w:t>
             </w:r>
           </w:p>
         </w:tc>
@@ -2180,7 +2180,7 @@
           </w:tcPr>
           <w:p>
             <w:r>
-              <w:t>1.0601302014581433</w:t>
+              <w:t>1.0059768368217632</w:t>
             </w:r>
           </w:p>
         </w:tc>
@@ -2190,7 +2190,7 @@
           </w:tcPr>
           <w:p>
             <w:r>
-              <w:t>1.7057211559301784</w:t>
+              <w:t>1.5353841921153606</w:t>
             </w:r>
           </w:p>
         </w:tc>
@@ -2487,7 +2487,7 @@
       <w:r>
         <w:drawing>
           <wp:inline xmlns:a="http://schemas.openxmlformats.org/drawingml/2006/main" xmlns:pic="http://schemas.openxmlformats.org/drawingml/2006/picture">
-            <wp:extent cx="5486400" cy="2832063"/>
+            <wp:extent cx="5486400" cy="2681642"/>
             <wp:docPr id="3" name="Picture 3"/>
             <wp:cNvGraphicFramePr>
               <a:graphicFrameLocks noChangeAspect="1"/>
@@ -2508,7 +2508,7 @@
                   <pic:spPr>
                     <a:xfrm>
                       <a:off x="0" y="0"/>
-                      <a:ext cx="5486400" cy="2832063"/>
+                      <a:ext cx="5486400" cy="2681642"/>
                     </a:xfrm>
                     <a:prstGeom prst="rect"/>
                   </pic:spPr>
@@ -2528,7 +2528,7 @@
       <w:r>
         <w:drawing>
           <wp:inline xmlns:a="http://schemas.openxmlformats.org/drawingml/2006/main" xmlns:pic="http://schemas.openxmlformats.org/drawingml/2006/picture">
-            <wp:extent cx="5486400" cy="3083888"/>
+            <wp:extent cx="5486400" cy="3108960"/>
             <wp:docPr id="4" name="Picture 4"/>
             <wp:cNvGraphicFramePr>
               <a:graphicFrameLocks noChangeAspect="1"/>
@@ -2549,7 +2549,7 @@
                   <pic:spPr>
                     <a:xfrm>
                       <a:off x="0" y="0"/>
-                      <a:ext cx="5486400" cy="3083888"/>
+                      <a:ext cx="5486400" cy="3108960"/>
                     </a:xfrm>
                     <a:prstGeom prst="rect"/>
                   </pic:spPr>

</xml_diff>